<commit_message>
Rewrite manuscript, ESI and figures to the revised claims: clustered H2, local SSCHA criterion, ORB-v2 split, R1.5 sensitivity (Tables S14-S17)
</commit_message>
<xml_diff>
--- a/paper/data_availability/data_availability_statement.docx
+++ b/paper/data_availability/data_availability_statement.docx
@@ -26,11 +26,13 @@
         <w:t xml:space="preserve"> </w:t>
       </w:r>
       <w:r>
-        <w:t xml:space="preserve">Finite-temperature dynamic stability separates foundation machine-learning interatomic potentials that harmonic benchmarks rank equally</w:t>
-      </w:r>
-      <w:r>
-        <w:t xml:space="preserve"> </w:t>
-      </w:r>
+        <w:t xml:space="preserve">Neither harmonic benchmarks nor a default SSCHA cross-check certifies a foundation machine-learning interatomic potential for finite-temperature dynamic stability</w:t>
+      </w:r>
+    </w:p>
+    <w:p>
+      <w:pPr>
+        <w:pStyle w:val="BodyText"/>
+      </w:pPr>
       <w:r>
         <w:rPr>
           <w:b/>
@@ -164,7 +166,7 @@
         <w:t xml:space="preserve"> </w:t>
       </w:r>
       <w:r>
-        <w:t xml:space="preserve">ledger). The SSCHA results reported are a full re-measurement (</w:t>
+        <w:t xml:space="preserve">ledger). The SSCHA results reported here are a full re-measurement (</w:t>
       </w:r>
       <w:r>
         <w:rPr>
@@ -173,28 +175,37 @@
         <w:t xml:space="preserve">scripts/run_sscha_v2.py</w:t>
       </w:r>
       <w:r>
-        <w:t xml:space="preserve">, method</w:t>
-      </w:r>
-      <w:r>
-        <w:t xml:space="preserve"> </w:t>
-      </w:r>
-      <w:r>
-        <w:t xml:space="preserve">version 3) of the original 208-unit grid in pinned environments (</w:t>
-      </w:r>
-      <w:r>
-        <w:rPr>
-          <w:rStyle w:val="VerbatimChar"/>
-        </w:rPr>
-        <w:t xml:space="preserve">envs/lock-*.txt</w:t>
-      </w:r>
-      <w:r>
-        <w:t xml:space="preserve">); superseded</w:t>
-      </w:r>
-      <w:r>
-        <w:t xml:space="preserve"> </w:t>
-      </w:r>
-      <w:r>
-        <w:t xml:space="preserve">generations are retained in the append-only ledger, with</w:t>
+        <w:t xml:space="preserve">,</w:t>
+      </w:r>
+      <w:r>
+        <w:t xml:space="preserve"> </w:t>
+      </w:r>
+      <w:r>
+        <w:t xml:space="preserve">method version 3) of the original 208-unit grid in the pinned environments, after two defects were</w:t>
+      </w:r>
+      <w:r>
+        <w:t xml:space="preserve"> </w:t>
+      </w:r>
+      <w:r>
+        <w:t xml:space="preserve">found in the original analysis path: an acoustic-mode identification inversion (the three</w:t>
+      </w:r>
+      <w:r>
+        <w:t xml:space="preserve"> </w:t>
+      </w:r>
+      <w:r>
+        <w:t xml:space="preserve">translational modes were selected by lowest frequency rather than smallest magnitude, which for an</w:t>
+      </w:r>
+      <w:r>
+        <w:t xml:space="preserve"> </w:t>
+      </w:r>
+      <w:r>
+        <w:t xml:space="preserve">unstable phase discards the soft mode itself), and an unrecorded software environment. The</w:t>
+      </w:r>
+      <w:r>
+        <w:t xml:space="preserve"> </w:t>
+      </w:r>
+      <w:r>
+        <w:t xml:space="preserve">superseded generations are retained in the append-only ledger —</w:t>
       </w:r>
       <w:r>
         <w:t xml:space="preserve"> </w:t>
@@ -209,25 +220,138 @@
         <w:t xml:space="preserve"> </w:t>
       </w:r>
       <w:r>
-        <w:t xml:space="preserve">selecting the current one, so every stage of the correction is auditable. Every headline number in</w:t>
-      </w:r>
-      <w:r>
-        <w:t xml:space="preserve"> </w:t>
-      </w:r>
-      <w:r>
-        <w:t xml:space="preserve">the manuscript is asserted against the ledger by</w:t>
-      </w:r>
-      <w:r>
-        <w:t xml:space="preserve"> </w:t>
+        <w:t xml:space="preserve">selects the current one — together with the in-place derived correction</w:t>
+      </w:r>
+      <w:r>
+        <w:t xml:space="preserve"> </w:t>
+      </w:r>
+      <w:r>
+        <w:t xml:space="preserve">(</w:t>
       </w:r>
       <w:r>
         <w:rPr>
           <w:rStyle w:val="VerbatimChar"/>
         </w:rPr>
-        <w:t xml:space="preserve">scripts/verify_claims.py</w:t>
-      </w:r>
-      <w:r>
-        <w:t xml:space="preserve">.</w:t>
+        <w:t xml:space="preserve">scripts/fix_sscha_acoustic.py</w:t>
+      </w:r>
+      <w:r>
+        <w:t xml:space="preserve">,</w:t>
+      </w:r>
+      <w:r>
+        <w:t xml:space="preserve"> </w:t>
+      </w:r>
+      <w:r>
+        <w:rPr>
+          <w:rStyle w:val="VerbatimChar"/>
+        </w:rPr>
+        <w:t xml:space="preserve">*_v1</w:t>
+      </w:r>
+      <w:r>
+        <w:t xml:space="preserve"> </w:t>
+      </w:r>
+      <w:r>
+        <w:t xml:space="preserve">columns) and the uncorrected snapshot</w:t>
+      </w:r>
+      <w:r>
+        <w:t xml:space="preserve"> </w:t>
+      </w:r>
+      <w:r>
+        <w:t xml:space="preserve">(</w:t>
+      </w:r>
+      <w:r>
+        <w:rPr>
+          <w:rStyle w:val="VerbatimChar"/>
+        </w:rPr>
+        <w:t xml:space="preserve">results/ledger.parquet.pre-d1-fix</w:t>
+      </w:r>
+      <w:r>
+        <w:t xml:space="preserve">), so every stage of the correction is auditable.</w:t>
+      </w:r>
+    </w:p>
+    <w:p>
+      <w:pPr>
+        <w:pStyle w:val="BodyText"/>
+      </w:pPr>
+      <w:r>
+        <w:t xml:space="preserve">The finite-temperature screen results reported here are the multi-mode grid described in §2.4</w:t>
+      </w:r>
+      <w:r>
+        <w:t xml:space="preserve"> </w:t>
+      </w:r>
+      <w:r>
+        <w:t xml:space="preserve">(5 models × 20 systems × 4 temperatures = 400 units). The ledger is append-only and also retains</w:t>
+      </w:r>
+      <w:r>
+        <w:t xml:space="preserve"> </w:t>
+      </w:r>
+      <w:r>
+        <w:t xml:space="preserve">the superseded single-mode rows;</w:t>
+      </w:r>
+      <w:r>
+        <w:t xml:space="preserve"> </w:t>
+      </w:r>
+      <w:r>
+        <w:rPr>
+          <w:rStyle w:val="VerbatimChar"/>
+        </w:rPr>
+        <w:t xml:space="preserve">mlip_dynstab.analysis.canonical</w:t>
+      </w:r>
+      <w:r>
+        <w:t xml:space="preserve"> </w:t>
+      </w:r>
+      <w:r>
+        <w:t xml:space="preserve">selects the current generation,</w:t>
+      </w:r>
+      <w:r>
+        <w:t xml:space="preserve"> </w:t>
+      </w:r>
+      <w:r>
+        <w:t xml:space="preserve">and every figure and statistic in this article is computed through it. The unit hash includes the</w:t>
+      </w:r>
+      <w:r>
+        <w:t xml:space="preserve"> </w:t>
+      </w:r>
+      <w:r>
+        <w:t xml:space="preserve">method version and the mode cap, so a re-run under a changed algorithm records new rows rather than</w:t>
+      </w:r>
+      <w:r>
+        <w:t xml:space="preserve"> </w:t>
+      </w:r>
+      <w:r>
+        <w:t xml:space="preserve">silently reusing old ones. Each model was run in its own pinned environment, with</w:t>
+      </w:r>
+      <w:r>
+        <w:t xml:space="preserve"> </w:t>
+      </w:r>
+      <w:r>
+        <w:rPr>
+          <w:rStyle w:val="VerbatimChar"/>
+        </w:rPr>
+        <w:t xml:space="preserve">pip freeze</w:t>
+      </w:r>
+      <w:r>
+        <w:t xml:space="preserve"> </w:t>
+      </w:r>
+      <w:r>
+        <w:t xml:space="preserve">manifests deposited as</w:t>
+      </w:r>
+      <w:r>
+        <w:t xml:space="preserve"> </w:t>
+      </w:r>
+      <w:r>
+        <w:rPr>
+          <w:rStyle w:val="VerbatimChar"/>
+        </w:rPr>
+        <w:t xml:space="preserve">envs/lock-&lt;model&gt;-2026-08-16.txt</w:t>
+      </w:r>
+      <w:r>
+        <w:t xml:space="preserve">; the 220 cached E(Q) maps are included so</w:t>
+      </w:r>
+      <w:r>
+        <w:t xml:space="preserve"> </w:t>
+      </w:r>
+      <w:r>
+        <w:t xml:space="preserve">the temperature solves regenerate without a GPU.</w:t>
       </w:r>
     </w:p>
     <w:bookmarkEnd w:id="9"/>

</xml_diff>

<commit_message>
PENDING-P5 filled: release v2.1.0 (commit 0343264), Zenodo version 10.5281/zenodo.23286095; data availability statement re-copied from the manuscript and rebuilt; letter PENDING-B1 dropped, DAS added to the file list
</commit_message>
<xml_diff>
--- a/paper/data_availability/data_availability_statement.docx
+++ b/paper/data_availability/data_availability_statement.docx
@@ -58,214 +58,25 @@
         <w:t xml:space="preserve"> </w:t>
       </w:r>
       <w:r>
-        <w:t xml:space="preserve">in the repository at https://github.com/fronkt/mlip-dynamic-stability and archived at Zenodo at</w:t>
-      </w:r>
-      <w:r>
-        <w:t xml:space="preserve"> </w:t>
-      </w:r>
-      <w:r>
-        <w:t xml:space="preserve">https://doi.org/10.5281/zenodo.20805799 (concept DOI, resolving to the latest version). The</w:t>
-      </w:r>
-      <w:r>
-        <w:t xml:space="preserve"> </w:t>
-      </w:r>
-      <w:r>
-        <w:t xml:space="preserve">production results regenerate from</w:t>
-      </w:r>
-      <w:r>
-        <w:t xml:space="preserve"> </w:t>
-      </w:r>
-      <w:r>
-        <w:rPr>
-          <w:rStyle w:val="VerbatimChar"/>
-        </w:rPr>
-        <w:t xml:space="preserve">results/ledger.parquet</w:t>
-      </w:r>
-      <w:r>
-        <w:t xml:space="preserve"> </w:t>
-      </w:r>
-      <w:r>
-        <w:t xml:space="preserve">(per-unit hashed, resumable) and the</w:t>
-      </w:r>
-      <w:r>
-        <w:t xml:space="preserve"> </w:t>
-      </w:r>
-      <w:r>
-        <w:t xml:space="preserve">finite-size runs from</w:t>
-      </w:r>
-      <w:r>
-        <w:t xml:space="preserve"> </w:t>
-      </w:r>
-      <w:r>
-        <w:rPr>
-          <w:rStyle w:val="VerbatimChar"/>
-        </w:rPr>
-        <w:t xml:space="preserve">results/convergence_study.parquet</w:t>
-      </w:r>
-      <w:r>
-        <w:t xml:space="preserve">; figures via</w:t>
-      </w:r>
-      <w:r>
-        <w:t xml:space="preserve"> </w:t>
-      </w:r>
-      <w:r>
-        <w:rPr>
-          <w:rStyle w:val="VerbatimChar"/>
-        </w:rPr>
-        <w:t xml:space="preserve">scripts/make_figures.py</w:t>
-      </w:r>
-      <w:r>
-        <w:t xml:space="preserve">,</w:t>
-      </w:r>
-      <w:r>
-        <w:t xml:space="preserve"> </w:t>
-      </w:r>
-      <w:r>
-        <w:t xml:space="preserve">analysis in</w:t>
-      </w:r>
-      <w:r>
-        <w:t xml:space="preserve"> </w:t>
-      </w:r>
-      <w:r>
-        <w:rPr>
-          <w:rStyle w:val="VerbatimChar"/>
-        </w:rPr>
-        <w:t xml:space="preserve">mlip_dynstab/analysis.py</w:t>
-      </w:r>
-      <w:r>
-        <w:t xml:space="preserve">, the SSCHA root-cause diagnostic in</w:t>
-      </w:r>
-      <w:r>
-        <w:t xml:space="preserve"> </w:t>
-      </w:r>
-      <w:r>
-        <w:rPr>
-          <w:rStyle w:val="VerbatimChar"/>
-        </w:rPr>
-        <w:t xml:space="preserve">scripts/sscha_v4_diag.py</w:t>
-      </w:r>
-      <w:r>
-        <w:t xml:space="preserve">, and the stochastic-reproducibility study (§3.5) via</w:t>
-      </w:r>
-      <w:r>
-        <w:t xml:space="preserve"> </w:t>
-      </w:r>
-      <w:r>
-        <w:rPr>
-          <w:rStyle w:val="VerbatimChar"/>
-        </w:rPr>
-        <w:t xml:space="preserve">scripts/sscha_repro.py</w:t>
-      </w:r>
-      <w:r>
-        <w:t xml:space="preserve"> </w:t>
-      </w:r>
-      <w:r>
-        <w:t xml:space="preserve">(its per-seed frequencies print to the run log rather than to the</w:t>
-      </w:r>
-      <w:r>
-        <w:t xml:space="preserve"> </w:t>
-      </w:r>
-      <w:r>
-        <w:t xml:space="preserve">ledger). The SSCHA results reported here are a full re-measurement (</w:t>
-      </w:r>
-      <w:r>
-        <w:rPr>
-          <w:rStyle w:val="VerbatimChar"/>
-        </w:rPr>
-        <w:t xml:space="preserve">scripts/run_sscha_v2.py</w:t>
-      </w:r>
-      <w:r>
-        <w:t xml:space="preserve">,</w:t>
-      </w:r>
-      <w:r>
-        <w:t xml:space="preserve"> </w:t>
-      </w:r>
-      <w:r>
-        <w:t xml:space="preserve">method version 3) of the original 208-unit grid in the pinned environments, after two defects were</w:t>
-      </w:r>
-      <w:r>
-        <w:t xml:space="preserve"> </w:t>
-      </w:r>
-      <w:r>
-        <w:t xml:space="preserve">found in the original analysis path: an acoustic-mode identification inversion (the three</w:t>
-      </w:r>
-      <w:r>
-        <w:t xml:space="preserve"> </w:t>
-      </w:r>
-      <w:r>
-        <w:t xml:space="preserve">translational modes were selected by lowest frequency rather than smallest magnitude, which for an</w:t>
-      </w:r>
-      <w:r>
-        <w:t xml:space="preserve"> </w:t>
-      </w:r>
-      <w:r>
-        <w:t xml:space="preserve">unstable phase discards the soft mode itself), and an unrecorded software environment. The</w:t>
-      </w:r>
-      <w:r>
-        <w:t xml:space="preserve"> </w:t>
-      </w:r>
-      <w:r>
-        <w:t xml:space="preserve">superseded generations are retained in the append-only ledger —</w:t>
-      </w:r>
-      <w:r>
-        <w:t xml:space="preserve"> </w:t>
-      </w:r>
-      <w:r>
-        <w:rPr>
-          <w:rStyle w:val="VerbatimChar"/>
-        </w:rPr>
-        <w:t xml:space="preserve">mlip_dynstab.analysis.canonical</w:t>
-      </w:r>
-      <w:r>
-        <w:t xml:space="preserve"> </w:t>
-      </w:r>
-      <w:r>
-        <w:t xml:space="preserve">selects the current one — together with the in-place derived correction</w:t>
-      </w:r>
-      <w:r>
-        <w:t xml:space="preserve"> </w:t>
-      </w:r>
-      <w:r>
-        <w:t xml:space="preserve">(</w:t>
-      </w:r>
-      <w:r>
-        <w:rPr>
-          <w:rStyle w:val="VerbatimChar"/>
-        </w:rPr>
-        <w:t xml:space="preserve">scripts/fix_sscha_acoustic.py</w:t>
-      </w:r>
-      <w:r>
-        <w:t xml:space="preserve">,</w:t>
-      </w:r>
-      <w:r>
-        <w:t xml:space="preserve"> </w:t>
-      </w:r>
-      <w:r>
-        <w:rPr>
-          <w:rStyle w:val="VerbatimChar"/>
-        </w:rPr>
-        <w:t xml:space="preserve">*_v1</w:t>
-      </w:r>
-      <w:r>
-        <w:t xml:space="preserve"> </w:t>
-      </w:r>
-      <w:r>
-        <w:t xml:space="preserve">columns) and the uncorrected snapshot</w:t>
-      </w:r>
-      <w:r>
-        <w:t xml:space="preserve"> </w:t>
-      </w:r>
-      <w:r>
-        <w:t xml:space="preserve">(</w:t>
-      </w:r>
-      <w:r>
-        <w:rPr>
-          <w:rStyle w:val="VerbatimChar"/>
-        </w:rPr>
-        <w:t xml:space="preserve">results/ledger.parquet.pre-d1-fix</w:t>
-      </w:r>
-      <w:r>
-        <w:t xml:space="preserve">), so every stage of the correction is auditable.</w:t>
+        <w:t xml:space="preserve">in the repository at https://github.com/fronkt/mlip-dynamic-stability. The version that produced</w:t>
+      </w:r>
+      <w:r>
+        <w:t xml:space="preserve"> </w:t>
+      </w:r>
+      <w:r>
+        <w:t xml:space="preserve">the numbers in this article is release v2.1.0 (commit 0343264) on the repository’s default branch,</w:t>
+      </w:r>
+      <w:r>
+        <w:t xml:space="preserve"> </w:t>
+      </w:r>
+      <w:r>
+        <w:t xml:space="preserve">archived at Zenodo as https://doi.org/10.5281/zenodo.23286095, a version under the concept DOI</w:t>
+      </w:r>
+      <w:r>
+        <w:t xml:space="preserve"> </w:t>
+      </w:r>
+      <w:r>
+        <w:t xml:space="preserve">https://doi.org/10.5281/zenodo.20805799, which resolves to the latest version.</w:t>
       </w:r>
     </w:p>
     <w:p>
@@ -273,19 +84,28 @@
         <w:pStyle w:val="BodyText"/>
       </w:pPr>
       <w:r>
-        <w:t xml:space="preserve">The finite-temperature screen results reported here are the multi-mode grid described in §2.4</w:t>
-      </w:r>
-      <w:r>
-        <w:t xml:space="preserve"> </w:t>
-      </w:r>
-      <w:r>
-        <w:t xml:space="preserve">(5 models × 20 systems × 4 temperatures = 400 units). The ledger is append-only and also retains</w:t>
-      </w:r>
-      <w:r>
-        <w:t xml:space="preserve"> </w:t>
-      </w:r>
-      <w:r>
-        <w:t xml:space="preserve">the superseded single-mode rows;</w:t>
+        <w:t xml:space="preserve">All production results regenerate from</w:t>
+      </w:r>
+      <w:r>
+        <w:t xml:space="preserve"> </w:t>
+      </w:r>
+      <w:r>
+        <w:rPr>
+          <w:rStyle w:val="VerbatimChar"/>
+        </w:rPr>
+        <w:t xml:space="preserve">results/ledger.parquet</w:t>
+      </w:r>
+      <w:r>
+        <w:t xml:space="preserve"> </w:t>
+      </w:r>
+      <w:r>
+        <w:t xml:space="preserve">(per-unit hashed, append-only,</w:t>
+      </w:r>
+      <w:r>
+        <w:t xml:space="preserve"> </w:t>
+      </w:r>
+      <w:r>
+        <w:t xml:space="preserve">resumable) through</w:t>
       </w:r>
       <w:r>
         <w:t xml:space="preserve"> </w:t>
@@ -297,28 +117,625 @@
         <w:t xml:space="preserve">mlip_dynstab.analysis.canonical</w:t>
       </w:r>
       <w:r>
-        <w:t xml:space="preserve"> </w:t>
-      </w:r>
-      <w:r>
-        <w:t xml:space="preserve">selects the current generation,</w:t>
-      </w:r>
-      <w:r>
-        <w:t xml:space="preserve"> </w:t>
-      </w:r>
-      <w:r>
-        <w:t xml:space="preserve">and every figure and statistic in this article is computed through it. The unit hash includes the</w:t>
-      </w:r>
-      <w:r>
-        <w:t xml:space="preserve"> </w:t>
-      </w:r>
-      <w:r>
-        <w:t xml:space="preserve">method version and the mode cap, so a re-run under a changed algorithm records new rows rather than</w:t>
-      </w:r>
-      <w:r>
-        <w:t xml:space="preserve"> </w:t>
-      </w:r>
-      <w:r>
-        <w:t xml:space="preserve">silently reusing old ones. Each model was run in its own pinned environment, with</w:t>
+        <w:t xml:space="preserve">, which selects the current generation of each</w:t>
+      </w:r>
+      <w:r>
+        <w:t xml:space="preserve"> </w:t>
+      </w:r>
+      <w:r>
+        <w:t xml:space="preserve">layer; every figure and statistic in this article is computed through it. Figures are made by</w:t>
+      </w:r>
+      <w:r>
+        <w:t xml:space="preserve"> </w:t>
+      </w:r>
+      <w:r>
+        <w:rPr>
+          <w:rStyle w:val="VerbatimChar"/>
+        </w:rPr>
+        <w:t xml:space="preserve">scripts/make_figures.py</w:t>
+      </w:r>
+      <w:r>
+        <w:t xml:space="preserve"> </w:t>
+      </w:r>
+      <w:r>
+        <w:t xml:space="preserve">and the analysis is in</w:t>
+      </w:r>
+      <w:r>
+        <w:t xml:space="preserve"> </w:t>
+      </w:r>
+      <w:r>
+        <w:rPr>
+          <w:rStyle w:val="VerbatimChar"/>
+        </w:rPr>
+        <w:t xml:space="preserve">mlip_dynstab/analysis.py</w:t>
+      </w:r>
+      <w:r>
+        <w:t xml:space="preserve">. The Wilson intervals</w:t>
+      </w:r>
+      <w:r>
+        <w:t xml:space="preserve"> </w:t>
+      </w:r>
+      <w:r>
+        <w:t xml:space="preserve">and the system-clustered tests are in</w:t>
+      </w:r>
+      <w:r>
+        <w:t xml:space="preserve"> </w:t>
+      </w:r>
+      <w:r>
+        <w:rPr>
+          <w:rStyle w:val="VerbatimChar"/>
+        </w:rPr>
+        <w:t xml:space="preserve">mlip_dynstab/stats.py</w:t>
+      </w:r>
+      <w:r>
+        <w:t xml:space="preserve">, run by</w:t>
+      </w:r>
+      <w:r>
+        <w:t xml:space="preserve"> </w:t>
+      </w:r>
+      <w:r>
+        <w:rPr>
+          <w:rStyle w:val="VerbatimChar"/>
+        </w:rPr>
+        <w:t xml:space="preserve">scripts/stats_hardening.py</w:t>
+      </w:r>
+      <w:r>
+        <w:t xml:space="preserve"> </w:t>
+      </w:r>
+      <w:r>
+        <w:t xml:space="preserve">into</w:t>
+      </w:r>
+      <w:r>
+        <w:t xml:space="preserve"> </w:t>
+      </w:r>
+      <w:r>
+        <w:rPr>
+          <w:rStyle w:val="VerbatimChar"/>
+        </w:rPr>
+        <w:t xml:space="preserve">results/stats_hardening.json</w:t>
+      </w:r>
+      <w:r>
+        <w:t xml:space="preserve">. The ESI tables are generated from the ledger and that file by</w:t>
+      </w:r>
+      <w:r>
+        <w:t xml:space="preserve"> </w:t>
+      </w:r>
+      <w:r>
+        <w:rPr>
+          <w:rStyle w:val="VerbatimChar"/>
+        </w:rPr>
+        <w:t xml:space="preserve">scripts/build_esi_tables.py</w:t>
+      </w:r>
+      <w:r>
+        <w:t xml:space="preserve">, whose</w:t>
+      </w:r>
+      <w:r>
+        <w:t xml:space="preserve"> </w:t>
+      </w:r>
+      <w:r>
+        <w:rPr>
+          <w:rStyle w:val="VerbatimChar"/>
+        </w:rPr>
+        <w:t xml:space="preserve">--check</w:t>
+      </w:r>
+      <w:r>
+        <w:t xml:space="preserve"> </w:t>
+      </w:r>
+      <w:r>
+        <w:t xml:space="preserve">option fails if the ESI on disk is out of date, and</w:t>
+      </w:r>
+      <w:r>
+        <w:t xml:space="preserve"> </w:t>
+      </w:r>
+      <w:r>
+        <w:rPr>
+          <w:rStyle w:val="VerbatimChar"/>
+        </w:rPr>
+        <w:t xml:space="preserve">scripts/verify_claims.py</w:t>
+      </w:r>
+      <w:r>
+        <w:t xml:space="preserve"> </w:t>
+      </w:r>
+      <w:r>
+        <w:t xml:space="preserve">re-derives the headline numbers from the ledger. The sensitivity</w:t>
+      </w:r>
+      <w:r>
+        <w:t xml:space="preserve"> </w:t>
+      </w:r>
+      <w:r>
+        <w:t xml:space="preserve">analysis of the screen (ESI Table S14) re-solves the cached E(Q) maps with</w:t>
+      </w:r>
+      <w:r>
+        <w:t xml:space="preserve"> </w:t>
+      </w:r>
+      <w:r>
+        <w:rPr>
+          <w:rStyle w:val="VerbatimChar"/>
+        </w:rPr>
+        <w:t xml:space="preserve">scripts/screen_sensitivity.py</w:t>
+      </w:r>
+      <w:r>
+        <w:t xml:space="preserve"> </w:t>
+      </w:r>
+      <w:r>
+        <w:t xml:space="preserve">into</w:t>
+      </w:r>
+      <w:r>
+        <w:t xml:space="preserve"> </w:t>
+      </w:r>
+      <w:r>
+        <w:rPr>
+          <w:rStyle w:val="VerbatimChar"/>
+        </w:rPr>
+        <w:t xml:space="preserve">results/screen_sensitivity.json</w:t>
+      </w:r>
+      <w:r>
+        <w:t xml:space="preserve">, and the</w:t>
+      </w:r>
+      <w:r>
+        <w:t xml:space="preserve"> </w:t>
+      </w:r>
+      <w:r>
+        <w:t xml:space="preserve">displacement-amplitude sweep (ESI Table S13) is run by</w:t>
+      </w:r>
+      <w:r>
+        <w:t xml:space="preserve"> </w:t>
+      </w:r>
+      <w:r>
+        <w:rPr>
+          <w:rStyle w:val="VerbatimChar"/>
+        </w:rPr>
+        <w:t xml:space="preserve">scripts/run_disp_sweep.py</w:t>
+      </w:r>
+      <w:r>
+        <w:t xml:space="preserve">, with its rows</w:t>
+      </w:r>
+      <w:r>
+        <w:t xml:space="preserve"> </w:t>
+      </w:r>
+      <w:r>
+        <w:t xml:space="preserve">in the ledger. The stage-by-stage SSCHA diagnostic of ESI Table S2 is</w:t>
+      </w:r>
+      <w:r>
+        <w:t xml:space="preserve"> </w:t>
+      </w:r>
+      <w:r>
+        <w:rPr>
+          <w:rStyle w:val="VerbatimChar"/>
+        </w:rPr>
+        <w:t xml:space="preserve">scripts/sscha_v4_diag.py</w:t>
+      </w:r>
+      <w:r>
+        <w:t xml:space="preserve">.</w:t>
+      </w:r>
+      <w:r>
+        <w:t xml:space="preserve"> </w:t>
+      </w:r>
+      <w:r>
+        <w:t xml:space="preserve">The bcc-Zr seed study of Section 3.5 is</w:t>
+      </w:r>
+      <w:r>
+        <w:t xml:space="preserve"> </w:t>
+      </w:r>
+      <w:r>
+        <w:rPr>
+          <w:rStyle w:val="VerbatimChar"/>
+        </w:rPr>
+        <w:t xml:space="preserve">scripts/sscha_repro.py</w:t>
+      </w:r>
+      <w:r>
+        <w:t xml:space="preserve">; its per-seed frequencies were printed to</w:t>
+      </w:r>
+      <w:r>
+        <w:t xml:space="preserve"> </w:t>
+      </w:r>
+      <w:r>
+        <w:t xml:space="preserve">the run log and are not deposited. The finite-size rows are in</w:t>
+      </w:r>
+      <w:r>
+        <w:t xml:space="preserve"> </w:t>
+      </w:r>
+      <w:r>
+        <w:rPr>
+          <w:rStyle w:val="VerbatimChar"/>
+        </w:rPr>
+        <w:t xml:space="preserve">results/convergence_study.parquet</w:t>
+      </w:r>
+      <w:r>
+        <w:t xml:space="preserve">,</w:t>
+      </w:r>
+      <w:r>
+        <w:t xml:space="preserve"> </w:t>
+      </w:r>
+      <w:r>
+        <w:t xml:space="preserve">whose SSCHA rows are the superseded v1 generation (Section 3.5). The SSCHA seed study with convergence</w:t>
+      </w:r>
+      <w:r>
+        <w:t xml:space="preserve"> </w:t>
+      </w:r>
+      <w:r>
+        <w:t xml:space="preserve">diagnostics, the 3×3×3 bcc-Zr re-measurement and the converged-recipe grid</w:t>
+      </w:r>
+      <w:r>
+        <w:t xml:space="preserve"> </w:t>
+      </w:r>
+      <w:r>
+        <w:t xml:space="preserve">(</w:t>
+      </w:r>
+      <w:r>
+        <w:rPr>
+          <w:rStyle w:val="VerbatimChar"/>
+        </w:rPr>
+        <w:t xml:space="preserve">scripts/sscha_seed_study.py</w:t>
+      </w:r>
+      <w:r>
+        <w:t xml:space="preserve">; the grid is compared with the production values by</w:t>
+      </w:r>
+      <w:r>
+        <w:t xml:space="preserve"> </w:t>
+      </w:r>
+      <w:r>
+        <w:rPr>
+          <w:rStyle w:val="VerbatimChar"/>
+        </w:rPr>
+        <w:t xml:space="preserve">scripts/grid_compare.py</w:t>
+      </w:r>
+      <w:r>
+        <w:t xml:space="preserve"> </w:t>
+      </w:r>
+      <w:r>
+        <w:t xml:space="preserve">into</w:t>
+      </w:r>
+      <w:r>
+        <w:t xml:space="preserve"> </w:t>
+      </w:r>
+      <w:r>
+        <w:rPr>
+          <w:rStyle w:val="VerbatimChar"/>
+        </w:rPr>
+        <w:t xml:space="preserve">results/revision/grid_compare.json</w:t>
+      </w:r>
+      <w:r>
+        <w:t xml:space="preserve">), the force-level ensemble test</w:t>
+      </w:r>
+      <w:r>
+        <w:t xml:space="preserve"> </w:t>
+      </w:r>
+      <w:r>
+        <w:t xml:space="preserve">(</w:t>
+      </w:r>
+      <w:r>
+        <w:rPr>
+          <w:rStyle w:val="VerbatimChar"/>
+        </w:rPr>
+        <w:t xml:space="preserve">scripts/force_spread.py</w:t>
+      </w:r>
+      <w:r>
+        <w:t xml:space="preserve">), the first-principles reference calculations</w:t>
+      </w:r>
+      <w:r>
+        <w:t xml:space="preserve"> </w:t>
+      </w:r>
+      <w:r>
+        <w:t xml:space="preserve">(</w:t>
+      </w:r>
+      <w:r>
+        <w:rPr>
+          <w:rStyle w:val="VerbatimChar"/>
+        </w:rPr>
+        <w:t xml:space="preserve">scripts/dft_reference.py</w:t>
+      </w:r>
+      <w:r>
+        <w:t xml:space="preserve">) and their convergence, functional and lattice checks</w:t>
+      </w:r>
+      <w:r>
+        <w:t xml:space="preserve"> </w:t>
+      </w:r>
+      <w:r>
+        <w:t xml:space="preserve">(</w:t>
+      </w:r>
+      <w:r>
+        <w:rPr>
+          <w:rStyle w:val="VerbatimChar"/>
+        </w:rPr>
+        <w:t xml:space="preserve">scripts/dft_checks.py</w:t>
+      </w:r>
+      <w:r>
+        <w:t xml:space="preserve">) write their outputs under</w:t>
+      </w:r>
+      <w:r>
+        <w:t xml:space="preserve"> </w:t>
+      </w:r>
+      <w:r>
+        <w:rPr>
+          <w:rStyle w:val="VerbatimChar"/>
+        </w:rPr>
+        <w:t xml:space="preserve">results/revision/</w:t>
+      </w:r>
+      <w:r>
+        <w:t xml:space="preserve">. The identity between</w:t>
+      </w:r>
+      <w:r>
+        <w:t xml:space="preserve"> </w:t>
+      </w:r>
+      <w:r>
+        <w:t xml:space="preserve">the screen’s symmetric-point curvature and its trial stiffness, and the origin of every negative</w:t>
+      </w:r>
+      <w:r>
+        <w:t xml:space="preserve"> </w:t>
+      </w:r>
+      <w:r>
+        <w:t xml:space="preserve">value of that observable, are checked by</w:t>
+      </w:r>
+      <w:r>
+        <w:t xml:space="preserve"> </w:t>
+      </w:r>
+      <w:r>
+        <w:rPr>
+          <w:rStyle w:val="VerbatimChar"/>
+        </w:rPr>
+        <w:t xml:space="preserve">scripts/curvature_identity_check.py</w:t>
+      </w:r>
+      <w:r>
+        <w:t xml:space="preserve"> </w:t>
+      </w:r>
+      <w:r>
+        <w:t xml:space="preserve">(into</w:t>
+      </w:r>
+      <w:r>
+        <w:t xml:space="preserve"> </w:t>
+      </w:r>
+      <w:r>
+        <w:rPr>
+          <w:rStyle w:val="VerbatimChar"/>
+        </w:rPr>
+        <w:t xml:space="preserve">results/curvature_identity_check.json</w:t>
+      </w:r>
+      <w:r>
+        <w:t xml:space="preserve">), and the H2 count under each frozen-cell convention by</w:t>
+      </w:r>
+      <w:r>
+        <w:t xml:space="preserve"> </w:t>
+      </w:r>
+      <w:r>
+        <w:rPr>
+          <w:rStyle w:val="VerbatimChar"/>
+        </w:rPr>
+        <w:t xml:space="preserve">scripts/h2_by_convention.py</w:t>
+      </w:r>
+      <w:r>
+        <w:t xml:space="preserve"> </w:t>
+      </w:r>
+      <w:r>
+        <w:t xml:space="preserve">(into</w:t>
+      </w:r>
+      <w:r>
+        <w:t xml:space="preserve"> </w:t>
+      </w:r>
+      <w:r>
+        <w:rPr>
+          <w:rStyle w:val="VerbatimChar"/>
+        </w:rPr>
+        <w:t xml:space="preserve">results/h2_by_convention.json</w:t>
+      </w:r>
+      <w:r>
+        <w:t xml:space="preserve">); both re-solve the cached</w:t>
+      </w:r>
+      <w:r>
+        <w:t xml:space="preserve"> </w:t>
+      </w:r>
+      <w:r>
+        <w:t xml:space="preserve">maps and need no GPU. The pre-registered fine-tuning trial (</w:t>
+      </w:r>
+      <w:r>
+        <w:rPr>
+          <w:rStyle w:val="VerbatimChar"/>
+        </w:rPr>
+        <w:t xml:space="preserve">scripts/finetune_trial.py</w:t>
+      </w:r>
+      <w:r>
+        <w:t xml:space="preserve">), the replicates</w:t>
+      </w:r>
+      <w:r>
+        <w:t xml:space="preserve"> </w:t>
+      </w:r>
+      <w:r>
+        <w:t xml:space="preserve">of the converged grid and the 4×4×4 attempt (runners in</w:t>
+      </w:r>
+      <w:r>
+        <w:t xml:space="preserve"> </w:t>
+      </w:r>
+      <w:r>
+        <w:rPr>
+          <w:rStyle w:val="VerbatimChar"/>
+        </w:rPr>
+        <w:t xml:space="preserve">scripts/box/as_run/</w:t>
+      </w:r>
+      <w:r>
+        <w:t xml:space="preserve">) also write under</w:t>
+      </w:r>
+      <w:r>
+        <w:t xml:space="preserve"> </w:t>
+      </w:r>
+      <w:r>
+        <w:rPr>
+          <w:rStyle w:val="VerbatimChar"/>
+        </w:rPr>
+        <w:t xml:space="preserve">results/revision/</w:t>
+      </w:r>
+      <w:r>
+        <w:t xml:space="preserve">, and their pre-registrations are in</w:t>
+      </w:r>
+      <w:r>
+        <w:t xml:space="preserve"> </w:t>
+      </w:r>
+      <w:r>
+        <w:rPr>
+          <w:rStyle w:val="VerbatimChar"/>
+        </w:rPr>
+        <w:t xml:space="preserve">tasks/</w:t>
+      </w:r>
+      <w:r>
+        <w:t xml:space="preserve">.</w:t>
+      </w:r>
+    </w:p>
+    <w:p>
+      <w:pPr>
+        <w:pStyle w:val="BodyText"/>
+      </w:pPr>
+      <w:r>
+        <w:t xml:space="preserve">The ledger is append-only and keeps each superseded generation beside the current one, so every</w:t>
+      </w:r>
+      <w:r>
+        <w:t xml:space="preserve"> </w:t>
+      </w:r>
+      <w:r>
+        <w:t xml:space="preserve">correction is auditable. The screen results reported here are the multi-mode grid of Section 2.4</w:t>
+      </w:r>
+      <w:r>
+        <w:t xml:space="preserve"> </w:t>
+      </w:r>
+      <w:r>
+        <w:t xml:space="preserve">(5 models × 20 systems × 4 temperatures = 400 units, method version 4). The first screen</w:t>
+      </w:r>
+      <w:r>
+        <w:t xml:space="preserve"> </w:t>
+      </w:r>
+      <w:r>
+        <w:t xml:space="preserve">generation in the ledger, a single-mode one, had two defects. Its Γ-point acoustic mask removed</w:t>
+      </w:r>
+      <w:r>
+        <w:t xml:space="preserve"> </w:t>
+      </w:r>
+      <w:r>
+        <w:t xml:space="preserve">the three lowest branches rather than the three nearest zero, which for an unstable phase deletes</w:t>
+      </w:r>
+      <w:r>
+        <w:t xml:space="preserve"> </w:t>
+      </w:r>
+      <w:r>
+        <w:t xml:space="preserve">the ferroelectric soft mode, and it was computed with a</w:t>
+      </w:r>
+      <w:r>
+        <w:t xml:space="preserve"> </w:t>
+      </w:r>
+      <w:r>
+        <w:rPr>
+          <w:b/>
+          <w:bCs/>
+        </w:rPr>
+        <w:t xml:space="preserve">q</w:t>
+      </w:r>
+      <w:r>
+        <w:t xml:space="preserve">-point search that had been replaced</w:t>
+      </w:r>
+      <w:r>
+        <w:t xml:space="preserve"> </w:t>
+      </w:r>
+      <w:r>
+        <w:t xml:space="preserve">in the code, because the unit hash did not carry the algorithm version and the stale units were</w:t>
+      </w:r>
+      <w:r>
+        <w:t xml:space="preserve"> </w:t>
+      </w:r>
+      <w:r>
+        <w:t xml:space="preserve">skipped as already present. The unit hash now includes the method version and the mode cap, so a</w:t>
+      </w:r>
+      <w:r>
+        <w:t xml:space="preserve"> </w:t>
+      </w:r>
+      <w:r>
+        <w:t xml:space="preserve">re-run under a changed algorithm records new rows rather than reusing old ones. The SSCHA results</w:t>
+      </w:r>
+      <w:r>
+        <w:t xml:space="preserve"> </w:t>
+      </w:r>
+      <w:r>
+        <w:t xml:space="preserve">are a full re-measurement (</w:t>
+      </w:r>
+      <w:r>
+        <w:rPr>
+          <w:rStyle w:val="VerbatimChar"/>
+        </w:rPr>
+        <w:t xml:space="preserve">scripts/run_sscha_v2.py</w:t>
+      </w:r>
+      <w:r>
+        <w:t xml:space="preserve">, method version 3) of the 208-unit grid in the</w:t>
+      </w:r>
+      <w:r>
+        <w:t xml:space="preserve"> </w:t>
+      </w:r>
+      <w:r>
+        <w:t xml:space="preserve">pinned environments. The first SSCHA generation took the three acoustic modes to be the lowest</w:t>
+      </w:r>
+      <w:r>
+        <w:t xml:space="preserve"> </w:t>
+      </w:r>
+      <w:r>
+        <w:t xml:space="preserve">frequencies rather than those smallest in magnitude, which discards the soft mode of an unstable</w:t>
+      </w:r>
+      <w:r>
+        <w:t xml:space="preserve"> </w:t>
+      </w:r>
+      <w:r>
+        <w:t xml:space="preserve">phase, and was computed in an unrecorded software environment. It is retained together with the</w:t>
+      </w:r>
+      <w:r>
+        <w:t xml:space="preserve"> </w:t>
+      </w:r>
+      <w:r>
+        <w:t xml:space="preserve">in-place derived correction (</w:t>
+      </w:r>
+      <w:r>
+        <w:rPr>
+          <w:rStyle w:val="VerbatimChar"/>
+        </w:rPr>
+        <w:t xml:space="preserve">scripts/fix_sscha_acoustic.py</w:t>
+      </w:r>
+      <w:r>
+        <w:t xml:space="preserve">,</w:t>
+      </w:r>
+      <w:r>
+        <w:t xml:space="preserve"> </w:t>
+      </w:r>
+      <w:r>
+        <w:rPr>
+          <w:rStyle w:val="VerbatimChar"/>
+        </w:rPr>
+        <w:t xml:space="preserve">*_v1</w:t>
+      </w:r>
+      <w:r>
+        <w:t xml:space="preserve"> </w:t>
+      </w:r>
+      <w:r>
+        <w:t xml:space="preserve">columns) and the uncorrected</w:t>
+      </w:r>
+      <w:r>
+        <w:t xml:space="preserve"> </w:t>
+      </w:r>
+      <w:r>
+        <w:t xml:space="preserve">snapshot (</w:t>
+      </w:r>
+      <w:r>
+        <w:rPr>
+          <w:rStyle w:val="VerbatimChar"/>
+        </w:rPr>
+        <w:t xml:space="preserve">results/ledger.parquet.pre-d1-fix</w:t>
+      </w:r>
+      <w:r>
+        <w:t xml:space="preserve">). The harmonic layer was likewise re-measured in the</w:t>
+      </w:r>
+      <w:r>
+        <w:t xml:space="preserve"> </w:t>
+      </w:r>
+      <w:r>
+        <w:t xml:space="preserve">pinned environments, and its first generation is kept as the replicate of ESI Section S1.2. Each model was</w:t>
+      </w:r>
+      <w:r>
+        <w:t xml:space="preserve"> </w:t>
+      </w:r>
+      <w:r>
+        <w:t xml:space="preserve">run in its own pinned environment, with</w:t>
       </w:r>
       <w:r>
         <w:t xml:space="preserve"> </w:t>
@@ -345,13 +762,28 @@
         <w:t xml:space="preserve">envs/lock-&lt;model&gt;-2026-08-16.txt</w:t>
       </w:r>
       <w:r>
-        <w:t xml:space="preserve">; the 220 cached E(Q) maps are included so</w:t>
-      </w:r>
-      <w:r>
-        <w:t xml:space="preserve"> </w:t>
-      </w:r>
-      <w:r>
-        <w:t xml:space="preserve">the temperature solves regenerate without a GPU.</w:t>
+        <w:t xml:space="preserve">. The cached E(Q) maps of the current screen generation</w:t>
+      </w:r>
+      <w:r>
+        <w:t xml:space="preserve"> </w:t>
+      </w:r>
+      <w:r>
+        <w:t xml:space="preserve">(</w:t>
+      </w:r>
+      <w:r>
+        <w:rPr>
+          <w:rStyle w:val="VerbatimChar"/>
+        </w:rPr>
+        <w:t xml:space="preserve">results/cache/softmode_v3m24_*.json</w:t>
+      </w:r>
+      <w:r>
+        <w:t xml:space="preserve">, one per system and model) are included, so the</w:t>
+      </w:r>
+      <w:r>
+        <w:t xml:space="preserve"> </w:t>
+      </w:r>
+      <w:r>
+        <w:t xml:space="preserve">temperature solves and the sensitivity analysis regenerate without a GPU.</w:t>
       </w:r>
     </w:p>
     <w:bookmarkEnd w:id="9"/>

</xml_diff>